<commit_message>
docs: shorten the handbook filename to distinguish it from the SDD
Rename TalentHub_系統文件與交接手冊.docx to TalentHub_交接手冊.docx, update the
five path references (README, SETUP-macOS, samples, SDD source) and regenerate
the SDD docx. The full title remains on the Word cover page, so in-text book
citations are unchanged.

Co-Authored-By: Claude Fable 5 <noreply@anthropic.com>
Claude-Session: https://claude.ai/code/session_013e96XUAnjCTccahYzrR7yN
</commit_message>
<xml_diff>
--- a/docs/TalentHub_系統規格書.docx
+++ b/docs/TalentHub_系統規格書.docx
@@ -284,7 +284,7 @@
     </w:p>
     <w:p>
       <w:r>
-        <w:t xml:space="preserve">本文件為 TalentHub 系統之軟體系統規格書（SDD），涵蓋系統之初步設計與細部設計，使系統開發者、維護者與交接者得以確認系統的實際需求與設計決策，並作為後續開發與維運時遵循的準繩。本文件內容整理自《TalentHub 系統文件與交接手冊》（docs/TalentHub_系統文件與交接手冊.docx，2026-08-27 定版）並與 2026-09-01 之程式碼現況核對。</w:t>
+        <w:t xml:space="preserve">本文件為 TalentHub 系統之軟體系統規格書（SDD），涵蓋系統之初步設計與細部設計，使系統開發者、維護者與交接者得以確認系統的實際需求與設計決策，並作為後續開發與維運時遵循的準繩。本文件內容整理自《TalentHub 系統文件與交接手冊》（docs/TalentHub_交接手冊.docx，2026-08-27 定版）並與 2026-09-01 之程式碼現況核對。</w:t>
       </w:r>
     </w:p>
     <w:p>
@@ -18738,7 +18738,7 @@
         <w:t xml:space="preserve">1. </w:t>
       </w:r>
       <w:r>
-        <w:t xml:space="preserve">《TalentHub 系統文件與交接手冊》docs/TalentHub_系統文件與交接手冊.docx（2026-08-27，本文件主要來源；主管摘要＋導讀＋編號章 01–08、10–13（09 刻意從缺）＋附錄 A–D）</w:t>
+        <w:t xml:space="preserve">《TalentHub 系統文件與交接手冊》docs/TalentHub_交接手冊.docx（2026-08-27，本文件主要來源；主管摘要＋導讀＋編號章 01–08、10–13（09 刻意從缺）＋附錄 A–D）</w:t>
       </w:r>
     </w:p>
     <w:p>

</xml_diff>

<commit_message>
feat: retire the macOS setup now that development stays on Windows
Remove setup-mac.sh, start/stop/restart-dev.sh and docs/SETUP-macOS.md, drop
the macOS notes from README and the SDD (bibliography renumbered, docx
regenerated), and delete the now-unused *.sh line-ending rule. The OS fallback
paths in the backend code stay: the Ubuntu CI runners use the same mechanism.

Co-Authored-By: Claude Fable 5 <noreply@anthropic.com>
Claude-Session: https://claude.ai/code/session_013e96XUAnjCTccahYzrR7yN
</commit_message>
<xml_diff>
--- a/docs/TalentHub_系統規格書.docx
+++ b/docs/TalentHub_系統規格書.docx
@@ -2050,7 +2050,7 @@
                 <w:szCs w:val="18"/>
                 <w:rFonts w:ascii="Consolas" w:cs="Consolas" w:eastAsia="Consolas" w:hAnsi="Consolas"/>
               </w:rPr>
-              <w:t xml:space="preserve">├── docs/                    # 交接手冊 docx、SETUP-macOS.md、本文件（src/ 為 Markdown 原始檔）</w:t>
+              <w:t xml:space="preserve">├── docs/                    # 交接手冊 docx、本文件（src/ 為 Markdown 原始檔）</w:t>
             </w:r>
           </w:p>
           <w:p>
@@ -3418,7 +3418,7 @@
               <w:jc w:val="left"/>
             </w:pPr>
             <w:r>
-              <w:t xml:space="preserve">Windows Server（現行內網 LAN 主機）／macOS（開發，見 docs/SETUP-macOS.md）／Linux（建議正式部署）</w:t>
+              <w:t xml:space="preserve">Windows Server（現行內網 LAN 主機）／Linux（建議正式部署）</w:t>
             </w:r>
           </w:p>
         </w:tc>
@@ -18755,7 +18755,7 @@
         <w:t xml:space="preserve">2. </w:t>
       </w:r>
       <w:r>
-        <w:t xml:space="preserve">《在 macOS 上重建 TalentHub 開發環境》docs/SETUP-macOS.md（2026-09-01）</w:t>
+        <w:t xml:space="preserve">《TalentHub Windows LAN deployment》deploy/windows-lan/README.md（2026-08-27，內網部署現況）</w:t>
       </w:r>
     </w:p>
     <w:p>
@@ -18772,7 +18772,7 @@
         <w:t xml:space="preserve">3. </w:t>
       </w:r>
       <w:r>
-        <w:t xml:space="preserve">《TalentHub Windows LAN deployment》deploy/windows-lan/README.md（2026-08-27，內網部署現況）</w:t>
+        <w:t xml:space="preserve">FastAPI 官方文件（fastapi.tiangolo.com）、Vue 3 官方文件（vuejs.org）、SQLAlchemy 2 文件、PostgreSQL 16 文件、Playwright 文件</w:t>
       </w:r>
     </w:p>
     <w:p>
@@ -18787,23 +18787,6 @@
           <w:color w:val="1F4E79"/>
         </w:rPr>
         <w:t xml:space="preserve">4. </w:t>
-      </w:r>
-      <w:r>
-        <w:t xml:space="preserve">FastAPI 官方文件（fastapi.tiangolo.com）、Vue 3 官方文件（vuejs.org）、SQLAlchemy 2 文件、PostgreSQL 16 文件、Playwright 文件</w:t>
-      </w:r>
-    </w:p>
-    <w:p>
-      <w:pPr>
-        <w:spacing w:after="60"/>
-        <w:ind w:left="360" w:hanging="280"/>
-      </w:pPr>
-      <w:r>
-        <w:rPr>
-          <w:b/>
-          <w:bCs/>
-          <w:color w:val="1F4E79"/>
-        </w:rPr>
-        <w:t xml:space="preserve">5. </w:t>
       </w:r>
       <w:r>
         <w:t xml:space="preserve">《個人資料保護法》及其施行細則（全國法規資料庫 law.moj.gov.tw）——個資蒐集、處理、利用、保存與當事人權利之法遵依據；系統對應設計見交接手冊第 08 章</w:t>

</xml_diff>